<commit_message>
likely ready to submit ppa
</commit_message>
<xml_diff>
--- a/docs/provisional_patent_application.docx
+++ b/docs/provisional_patent_application.docx
@@ -2,7 +2,7 @@
 <file path=word/document.xml><?xml version="1.0" encoding="utf-8"?>
 <w:document xmlns:w="http://schemas.openxmlformats.org/wordprocessingml/2006/main" xmlns:m="http://schemas.openxmlformats.org/officeDocument/2006/math" xmlns:r="http://schemas.openxmlformats.org/officeDocument/2006/relationships" xmlns:o="urn:schemas-microsoft-com:office:office" xmlns:v="urn:schemas-microsoft-com:vml" xmlns:w10="urn:schemas-microsoft-com:office:word" xmlns:a="http://schemas.openxmlformats.org/drawingml/2006/main" xmlns:pic="http://schemas.openxmlformats.org/drawingml/2006/picture" xmlns:wp="http://schemas.openxmlformats.org/drawingml/2006/wordprocessingDrawing">
   <w:body>
-    <w:bookmarkStart w:id="38" w:name="provisional-patent-application"/>
+    <w:bookmarkStart w:id="42" w:name="provisional-patent-application"/>
     <w:p>
       <w:pPr>
         <w:pStyle w:val="Heading1"/>
@@ -47,13 +47,6 @@
         <w:t xml:space="preserve">SYSTEM AND METHOD FOR GEOMETRIC REPRESENTATION, ANALYSIS, AND VISUALIZATION OF EMOTIONAL STATES USING QUATERNION MATHEMATICS</w:t>
       </w:r>
     </w:p>
-    <w:p>
-      <w:r>
-        <w:pict>
-          <v:rect style="width:0;height:1.5pt" o:hralign="center" o:hrstd="t" o:hr="t"/>
-        </w:pict>
-      </w:r>
-    </w:p>
     <w:bookmarkStart w:id="9" w:name="abstract"/>
     <w:p>
       <w:pPr>
@@ -81,13 +74,6 @@
       </w:r>
       <w:r>
         <w:t xml:space="preserve">metric based on the angular distance between quaternions and detects emotional flooding by analyzing the rate of change (angular velocity) of these states over time.</w:t>
-      </w:r>
-    </w:p>
-    <w:p>
-      <w:r>
-        <w:pict>
-          <v:rect style="width:0;height:1.5pt" o:hralign="center" o:hrstd="t" o:hr="t"/>
-        </w:pict>
       </w:r>
     </w:p>
     <w:bookmarkEnd w:id="9"/>
@@ -172,13 +158,6 @@
         <w:t xml:space="preserve">problem or singularities when attempting to model continuous emotional transitions in 3D space using Euler angles. There is a need for a more robust mathematical framework that can accurately capture the relational dimension of emotion and model smooth, continuous transitions between states.</w:t>
       </w:r>
     </w:p>
-    <w:p>
-      <w:r>
-        <w:pict>
-          <v:rect style="width:0;height:1.5pt" o:hralign="center" o:hrstd="t" o:hr="t"/>
-        </w:pict>
-      </w:r>
-    </w:p>
     <w:bookmarkEnd w:id="10"/>
     <w:bookmarkStart w:id="11" w:name="summary-of-the-invention"/>
     <w:p>
@@ -342,7 +321,7 @@
       </w:r>
     </w:p>
     <w:bookmarkEnd w:id="11"/>
-    <w:bookmarkStart w:id="30" w:name="brief-description-of-the-drawings"/>
+    <w:bookmarkStart w:id="33" w:name="brief-description-of-the-drawings"/>
     <w:p>
       <w:pPr>
         <w:pStyle w:val="Heading2"/>
@@ -376,7 +355,7 @@
       <w:r>
         <w:drawing>
           <wp:inline>
-            <wp:extent cx="4000500" cy="9381172"/>
+            <wp:extent cx="2933700" cy="6879526"/>
             <wp:effectExtent b="0" l="0" r="0" t="0"/>
             <wp:docPr descr="FIG. 1: System Architecture" title="" id="13" name="Picture"/>
             <a:graphic>
@@ -397,7 +376,7 @@
                   <pic:spPr bwMode="auto">
                     <a:xfrm>
                       <a:off x="0" y="0"/>
-                      <a:ext cx="4000500" cy="9381172"/>
+                      <a:ext cx="2933700" cy="6879526"/>
                     </a:xfrm>
                     <a:prstGeom prst="rect">
                       <a:avLst/>
@@ -449,7 +428,7 @@
       <w:r>
         <w:drawing>
           <wp:inline>
-            <wp:extent cx="5334000" cy="1543869"/>
+            <wp:extent cx="5067300" cy="1466676"/>
             <wp:effectExtent b="0" l="0" r="0" t="0"/>
             <wp:docPr descr="FIG. 2: VAC Coordinate System" title="" id="16" name="Picture"/>
             <a:graphic>
@@ -470,7 +449,7 @@
                   <pic:spPr bwMode="auto">
                     <a:xfrm>
                       <a:off x="0" y="0"/>
-                      <a:ext cx="5334000" cy="1543869"/>
+                      <a:ext cx="5067300" cy="1466676"/>
                     </a:xfrm>
                     <a:prstGeom prst="rect">
                       <a:avLst/>
@@ -522,7 +501,7 @@
       <w:r>
         <w:drawing>
           <wp:inline>
-            <wp:extent cx="5334000" cy="2680607"/>
+            <wp:extent cx="5067300" cy="2546576"/>
             <wp:effectExtent b="0" l="0" r="0" t="0"/>
             <wp:docPr descr="FIG. 3: Listener Pipeline" title="" id="19" name="Picture"/>
             <a:graphic>
@@ -543,7 +522,7 @@
                   <pic:spPr bwMode="auto">
                     <a:xfrm>
                       <a:off x="0" y="0"/>
-                      <a:ext cx="5334000" cy="2680607"/>
+                      <a:ext cx="5067300" cy="2546576"/>
                     </a:xfrm>
                     <a:prstGeom prst="rect">
                       <a:avLst/>
@@ -595,7 +574,7 @@
       <w:r>
         <w:drawing>
           <wp:inline>
-            <wp:extent cx="5334000" cy="9440626"/>
+            <wp:extent cx="2933700" cy="5192344"/>
             <wp:effectExtent b="0" l="0" r="0" t="0"/>
             <wp:docPr descr="FIG. 4: Versor Engine Logic" title="" id="22" name="Picture"/>
             <a:graphic>
@@ -616,7 +595,7 @@
                   <pic:spPr bwMode="auto">
                     <a:xfrm>
                       <a:off x="0" y="0"/>
-                      <a:ext cx="5334000" cy="9440626"/>
+                      <a:ext cx="2933700" cy="5192344"/>
                     </a:xfrm>
                     <a:prstGeom prst="rect">
                       <a:avLst/>
@@ -680,7 +659,7 @@
       <w:r>
         <w:drawing>
           <wp:inline>
-            <wp:extent cx="4000500" cy="4000500"/>
+            <wp:extent cx="5067300" cy="5067300"/>
             <wp:effectExtent b="0" l="0" r="0" t="0"/>
             <wp:docPr descr="FIG. 5: Soul Sphere Visualization" title="" id="25" name="Picture"/>
             <a:graphic>
@@ -701,7 +680,7 @@
                   <pic:spPr bwMode="auto">
                     <a:xfrm>
                       <a:off x="0" y="0"/>
-                      <a:ext cx="4000500" cy="4000500"/>
+                      <a:ext cx="5067300" cy="5067300"/>
                     </a:xfrm>
                     <a:prstGeom prst="rect">
                       <a:avLst/>
@@ -765,7 +744,7 @@
       <w:r>
         <w:drawing>
           <wp:inline>
-            <wp:extent cx="4000500" cy="6741000"/>
+            <wp:extent cx="2933700" cy="4943400"/>
             <wp:effectExtent b="0" l="0" r="0" t="0"/>
             <wp:docPr descr="FIG. 6: Emotional Atlas Data Structure" title="" id="28" name="Picture"/>
             <a:graphic>
@@ -786,7 +765,7 @@
                   <pic:spPr bwMode="auto">
                     <a:xfrm>
                       <a:off x="0" y="0"/>
-                      <a:ext cx="4000500" cy="6741000"/>
+                      <a:ext cx="2933700" cy="4943400"/>
                     </a:xfrm>
                     <a:prstGeom prst="rect">
                       <a:avLst/>
@@ -814,14 +793,80 @@
       </w:r>
     </w:p>
     <w:p>
-      <w:r>
-        <w:pict>
-          <v:rect style="width:0;height:1.5pt" o:hralign="center" o:hrstd="t" o:hr="t"/>
-        </w:pict>
-      </w:r>
-    </w:p>
-    <w:bookmarkEnd w:id="30"/>
-    <w:bookmarkStart w:id="36" w:name="detailed-description-of-the-invention"/>
+      <w:pPr>
+        <w:pStyle w:val="BodyText"/>
+      </w:pPr>
+      <w:r>
+        <w:rPr>
+          <w:b/>
+          <w:bCs/>
+        </w:rPr>
+        <w:t xml:space="preserve">FIG. 7</w:t>
+      </w:r>
+      <w:r>
+        <w:t xml:space="preserve"> </w:t>
+      </w:r>
+      <w:r>
+        <w:t xml:space="preserve">is a screenshot of the system’s graphical user interface during a live session.</w:t>
+      </w:r>
+    </w:p>
+    <w:p>
+      <w:pPr>
+        <w:pStyle w:val="CaptionedFigure"/>
+      </w:pPr>
+      <w:r>
+        <w:drawing>
+          <wp:inline>
+            <wp:extent cx="5067300" cy="3275563"/>
+            <wp:effectExtent b="0" l="0" r="0" t="0"/>
+            <wp:docPr descr="FIG. 7: User Interface Screenshot" title="" id="31" name="Picture"/>
+            <a:graphic>
+              <a:graphicData uri="http://schemas.openxmlformats.org/drawingml/2006/picture">
+                <pic:pic>
+                  <pic:nvPicPr>
+                    <pic:cNvPr descr="figures/love.png" id="32" name="Picture"/>
+                    <pic:cNvPicPr>
+                      <a:picLocks noChangeArrowheads="1" noChangeAspect="1"/>
+                    </pic:cNvPicPr>
+                  </pic:nvPicPr>
+                  <pic:blipFill>
+                    <a:blip r:embed="rId30"/>
+                    <a:stretch>
+                      <a:fillRect/>
+                    </a:stretch>
+                  </pic:blipFill>
+                  <pic:spPr bwMode="auto">
+                    <a:xfrm>
+                      <a:off x="0" y="0"/>
+                      <a:ext cx="5067300" cy="3275563"/>
+                    </a:xfrm>
+                    <a:prstGeom prst="rect">
+                      <a:avLst/>
+                    </a:prstGeom>
+                    <a:noFill/>
+                    <a:ln w="9525">
+                      <a:noFill/>
+                      <a:headEnd/>
+                      <a:tailEnd/>
+                    </a:ln>
+                  </pic:spPr>
+                </pic:pic>
+              </a:graphicData>
+            </a:graphic>
+          </wp:inline>
+        </w:drawing>
+      </w:r>
+    </w:p>
+    <w:p>
+      <w:pPr>
+        <w:pStyle w:val="ImageCaption"/>
+      </w:pPr>
+      <w:r>
+        <w:t xml:space="preserve">FIG. 7: User Interface Screenshot</w:t>
+      </w:r>
+    </w:p>
+    <w:bookmarkEnd w:id="33"/>
+    <w:bookmarkStart w:id="40" w:name="detailed-description-of-the-invention"/>
     <w:p>
       <w:pPr>
         <w:pStyle w:val="Heading2"/>
@@ -830,7 +875,7 @@
         <w:t xml:space="preserve">DETAILED DESCRIPTION OF THE INVENTION</w:t>
       </w:r>
     </w:p>
-    <w:bookmarkStart w:id="31" w:name="X77d8b82a6ce5dd554930e8f8929351a46b171e0"/>
+    <w:bookmarkStart w:id="34" w:name="X77d8b82a6ce5dd554930e8f8929351a46b171e0"/>
     <w:p>
       <w:pPr>
         <w:pStyle w:val="Heading3"/>
@@ -1031,8 +1076,8 @@
         <w:t xml:space="preserve">) to calibrate its output on the Connection axis.</w:t>
       </w:r>
     </w:p>
-    <w:bookmarkEnd w:id="31"/>
-    <w:bookmarkStart w:id="32" w:name="quaternion-representation-the-versor"/>
+    <w:bookmarkEnd w:id="34"/>
+    <w:bookmarkStart w:id="35" w:name="quaternion-representation-the-versor"/>
     <w:p>
       <w:pPr>
         <w:pStyle w:val="Heading3"/>
@@ -1170,21 +1215,7 @@
         <w:pStyle w:val="BodyText"/>
       </w:pPr>
       <w:r>
-        <w:t xml:space="preserve">The conversion from the 3D VAC vector to a 4D quaternion is achieved by treating the VAC vector as an axis-angle rotation, where the magnitude of the emotion determines the angle</w:t>
-      </w:r>
-      <w:r>
-        <w:t xml:space="preserve"> </w:t>
-      </w:r>
-      <m:oMath>
-        <m:r>
-          <m:t>θ</m:t>
-        </m:r>
-      </m:oMath>
-      <w:r>
-        <w:t xml:space="preserve"> </w:t>
-      </w:r>
-      <w:r>
-        <w:t xml:space="preserve">and the normalized VAC vector defines the axis of rotation.</w:t>
+        <w:t xml:space="preserve">The conversion from the 3D VAC vector to a 4D quaternion is achieved by treating the VAC vector as an axis-angle rotation, where the magnitude of the emotion determines the angle θ and the normalized VAC vector defines the axis of rotation.</w:t>
       </w:r>
     </w:p>
     <w:p>
@@ -1487,87 +1518,102 @@
             </m:rPr>
             <m:t>=</m:t>
           </m:r>
-          <m:f>
-            <m:fPr>
-              <m:type m:val="bar"/>
-            </m:fPr>
-            <m:num>
-              <m:r>
-                <m:rPr>
-                  <m:sty m:val="p"/>
-                </m:rPr>
-                <m:t>sin</m:t>
-              </m:r>
-              <m:r>
-                <m:rPr>
-                  <m:sty m:val="p"/>
-                </m:rPr>
-                <m:t>(</m:t>
-              </m:r>
-              <m:r>
-                <m:rPr>
-                  <m:sty m:val="p"/>
-                </m:rPr>
-                <m:t>(</m:t>
-              </m:r>
-              <m:r>
-                <m:t>1</m:t>
-              </m:r>
-              <m:r>
-                <m:rPr>
-                  <m:sty m:val="p"/>
-                </m:rPr>
-                <m:t>−</m:t>
-              </m:r>
-              <m:r>
-                <m:t>t</m:t>
-              </m:r>
-              <m:r>
-                <m:rPr>
-                  <m:sty m:val="p"/>
-                </m:rPr>
-                <m:t>)</m:t>
-              </m:r>
-              <m:r>
-                <m:rPr>
-                  <m:sty m:val="p"/>
-                </m:rPr>
-                <m:t>Ω</m:t>
-              </m:r>
-              <m:r>
-                <m:rPr>
-                  <m:sty m:val="p"/>
-                </m:rPr>
-                <m:t>)</m:t>
-              </m:r>
-            </m:num>
-            <m:den>
-              <m:r>
-                <m:rPr>
-                  <m:sty m:val="p"/>
-                </m:rPr>
-                <m:t>sin</m:t>
-              </m:r>
-              <m:r>
-                <m:rPr>
-                  <m:sty m:val="p"/>
-                </m:rPr>
-                <m:t>(</m:t>
-              </m:r>
-              <m:r>
-                <m:rPr>
-                  <m:sty m:val="p"/>
-                </m:rPr>
-                <m:t>Ω</m:t>
-              </m:r>
-              <m:r>
-                <m:rPr>
-                  <m:sty m:val="p"/>
-                </m:rPr>
-                <m:t>)</m:t>
-              </m:r>
-            </m:den>
-          </m:f>
+          <m:r>
+            <m:rPr>
+              <m:sty m:val="p"/>
+            </m:rPr>
+            <m:t>[</m:t>
+          </m:r>
+          <m:r>
+            <m:rPr>
+              <m:sty m:val="p"/>
+            </m:rPr>
+            <m:t>sin</m:t>
+          </m:r>
+          <m:r>
+            <m:rPr>
+              <m:sty m:val="p"/>
+            </m:rPr>
+            <m:t>(</m:t>
+          </m:r>
+          <m:r>
+            <m:rPr>
+              <m:sty m:val="p"/>
+            </m:rPr>
+            <m:t>(</m:t>
+          </m:r>
+          <m:r>
+            <m:t>1</m:t>
+          </m:r>
+          <m:r>
+            <m:rPr>
+              <m:sty m:val="p"/>
+            </m:rPr>
+            <m:t>−</m:t>
+          </m:r>
+          <m:r>
+            <m:t>t</m:t>
+          </m:r>
+          <m:r>
+            <m:rPr>
+              <m:sty m:val="p"/>
+            </m:rPr>
+            <m:t>)</m:t>
+          </m:r>
+          <m:r>
+            <m:rPr>
+              <m:sty m:val="p"/>
+            </m:rPr>
+            <m:t>Ω</m:t>
+          </m:r>
+          <m:r>
+            <m:rPr>
+              <m:sty m:val="p"/>
+            </m:rPr>
+            <m:t>)</m:t>
+          </m:r>
+          <m:r>
+            <m:rPr>
+              <m:sty m:val="p"/>
+            </m:rPr>
+            <m:t>/</m:t>
+          </m:r>
+          <m:r>
+            <m:rPr>
+              <m:sty m:val="p"/>
+            </m:rPr>
+            <m:t>sin</m:t>
+          </m:r>
+          <m:r>
+            <m:rPr>
+              <m:sty m:val="p"/>
+            </m:rPr>
+            <m:t>(</m:t>
+          </m:r>
+          <m:r>
+            <m:rPr>
+              <m:sty m:val="p"/>
+            </m:rPr>
+            <m:t>Ω</m:t>
+          </m:r>
+          <m:r>
+            <m:rPr>
+              <m:sty m:val="p"/>
+            </m:rPr>
+            <m:t>)</m:t>
+          </m:r>
+          <m:r>
+            <m:rPr>
+              <m:sty m:val="p"/>
+            </m:rPr>
+            <m:t>]</m:t>
+          </m:r>
+          <m:r>
+            <m:rPr>
+              <m:sty m:val="p"/>
+            </m:rPr>
+            <m:t>⋅</m:t>
+          </m:r>
           <m:sSub>
             <m:e>
               <m:r>
@@ -1586,66 +1632,81 @@
             </m:rPr>
             <m:t>+</m:t>
           </m:r>
-          <m:f>
-            <m:fPr>
-              <m:type m:val="bar"/>
-            </m:fPr>
-            <m:num>
-              <m:r>
-                <m:rPr>
-                  <m:sty m:val="p"/>
-                </m:rPr>
-                <m:t>sin</m:t>
-              </m:r>
-              <m:r>
-                <m:rPr>
-                  <m:sty m:val="p"/>
-                </m:rPr>
-                <m:t>(</m:t>
-              </m:r>
-              <m:r>
-                <m:t>t</m:t>
-              </m:r>
-              <m:r>
-                <m:rPr>
-                  <m:sty m:val="p"/>
-                </m:rPr>
-                <m:t>Ω</m:t>
-              </m:r>
-              <m:r>
-                <m:rPr>
-                  <m:sty m:val="p"/>
-                </m:rPr>
-                <m:t>)</m:t>
-              </m:r>
-            </m:num>
-            <m:den>
-              <m:r>
-                <m:rPr>
-                  <m:sty m:val="p"/>
-                </m:rPr>
-                <m:t>sin</m:t>
-              </m:r>
-              <m:r>
-                <m:rPr>
-                  <m:sty m:val="p"/>
-                </m:rPr>
-                <m:t>(</m:t>
-              </m:r>
-              <m:r>
-                <m:rPr>
-                  <m:sty m:val="p"/>
-                </m:rPr>
-                <m:t>Ω</m:t>
-              </m:r>
-              <m:r>
-                <m:rPr>
-                  <m:sty m:val="p"/>
-                </m:rPr>
-                <m:t>)</m:t>
-              </m:r>
-            </m:den>
-          </m:f>
+          <m:r>
+            <m:rPr>
+              <m:sty m:val="p"/>
+            </m:rPr>
+            <m:t>[</m:t>
+          </m:r>
+          <m:r>
+            <m:rPr>
+              <m:sty m:val="p"/>
+            </m:rPr>
+            <m:t>sin</m:t>
+          </m:r>
+          <m:r>
+            <m:rPr>
+              <m:sty m:val="p"/>
+            </m:rPr>
+            <m:t>(</m:t>
+          </m:r>
+          <m:r>
+            <m:t>t</m:t>
+          </m:r>
+          <m:r>
+            <m:rPr>
+              <m:sty m:val="p"/>
+            </m:rPr>
+            <m:t>Ω</m:t>
+          </m:r>
+          <m:r>
+            <m:rPr>
+              <m:sty m:val="p"/>
+            </m:rPr>
+            <m:t>)</m:t>
+          </m:r>
+          <m:r>
+            <m:rPr>
+              <m:sty m:val="p"/>
+            </m:rPr>
+            <m:t>/</m:t>
+          </m:r>
+          <m:r>
+            <m:rPr>
+              <m:sty m:val="p"/>
+            </m:rPr>
+            <m:t>sin</m:t>
+          </m:r>
+          <m:r>
+            <m:rPr>
+              <m:sty m:val="p"/>
+            </m:rPr>
+            <m:t>(</m:t>
+          </m:r>
+          <m:r>
+            <m:rPr>
+              <m:sty m:val="p"/>
+            </m:rPr>
+            <m:t>Ω</m:t>
+          </m:r>
+          <m:r>
+            <m:rPr>
+              <m:sty m:val="p"/>
+            </m:rPr>
+            <m:t>)</m:t>
+          </m:r>
+          <m:r>
+            <m:rPr>
+              <m:sty m:val="p"/>
+            </m:rPr>
+            <m:t>]</m:t>
+          </m:r>
+          <m:r>
+            <m:rPr>
+              <m:sty m:val="p"/>
+            </m:rPr>
+            <m:t>⋅</m:t>
+          </m:r>
           <m:sSub>
             <m:e>
               <m:r>
@@ -1698,8 +1759,8 @@
         <w:t xml:space="preserve">flow of feeling rather than a mechanical snap.</w:t>
       </w:r>
     </w:p>
-    <w:bookmarkEnd w:id="32"/>
-    <w:bookmarkStart w:id="33" w:name="emotional-work-flooding"/>
+    <w:bookmarkEnd w:id="35"/>
+    <w:bookmarkStart w:id="36" w:name="emotional-work-flooding"/>
     <w:p>
       <w:pPr>
         <w:pStyle w:val="Heading3"/>
@@ -1725,18 +1786,7 @@
         <w:t xml:space="preserve"> </w:t>
       </w:r>
       <w:r>
-        <w:t xml:space="preserve">as the geodesic distance (angle</w:t>
-      </w:r>
-      <w:r>
-        <w:t xml:space="preserve"> </w:t>
-      </w:r>
-      <m:oMath>
-        <m:r>
-          <m:t>θ</m:t>
-        </m:r>
-      </m:oMath>
-      <w:r>
-        <w:t xml:space="preserve">) traveled on the hypersphere between two states.</w:t>
+        <w:t xml:space="preserve">as the geodesic distance (angle θ) traveled on the hypersphere between two states.</w:t>
       </w:r>
       <w:r>
         <w:t xml:space="preserve"> </w:t>
@@ -1775,27 +1825,24 @@
             </m:rPr>
             <m:t>=</m:t>
           </m:r>
-          <m:f>
-            <m:fPr>
-              <m:type m:val="bar"/>
-            </m:fPr>
-            <m:num>
-              <m:r>
-                <m:t>d</m:t>
-              </m:r>
-              <m:r>
-                <m:t>θ</m:t>
-              </m:r>
-            </m:num>
-            <m:den>
-              <m:r>
-                <m:t>d</m:t>
-              </m:r>
-              <m:r>
-                <m:t>t</m:t>
-              </m:r>
-            </m:den>
-          </m:f>
+          <m:r>
+            <m:t>d</m:t>
+          </m:r>
+          <m:r>
+            <m:t>θ</m:t>
+          </m:r>
+          <m:r>
+            <m:rPr>
+              <m:sty m:val="p"/>
+            </m:rPr>
+            <m:t>/</m:t>
+          </m:r>
+          <m:r>
+            <m:t>d</m:t>
+          </m:r>
+          <m:r>
+            <m:t>t</m:t>
+          </m:r>
         </m:oMath>
       </m:oMathPara>
     </w:p>
@@ -1862,8 +1909,8 @@
         <w:t xml:space="preserve">), providing immediate feedback to the user to slow down.</w:t>
       </w:r>
     </w:p>
-    <w:bookmarkEnd w:id="33"/>
-    <w:bookmarkStart w:id="34" w:name="the-emotional-atlas-observer-module"/>
+    <w:bookmarkEnd w:id="36"/>
+    <w:bookmarkStart w:id="37" w:name="the-emotional-atlas-observer-module"/>
     <w:p>
       <w:pPr>
         <w:pStyle w:val="Heading3"/>
@@ -2033,8 +2080,8 @@
         <w:t xml:space="preserve">serves as a immutable reference map, allowing the system to snap vague user inputs to precise, clinically recognized emotional coordinates.</w:t>
       </w:r>
     </w:p>
-    <w:bookmarkEnd w:id="34"/>
-    <w:bookmarkStart w:id="35" w:name="privacy-centric-architecture"/>
+    <w:bookmarkEnd w:id="37"/>
+    <w:bookmarkStart w:id="38" w:name="privacy-centric-architecture"/>
     <w:p>
       <w:pPr>
         <w:pStyle w:val="Heading3"/>
@@ -2063,15 +2110,15 @@
       <w:r>
         <w:t xml:space="preserve">.</w:t>
       </w:r>
-      <w:r>
-        <w:t xml:space="preserve"> </w:t>
-      </w:r>
-      <w:r>
-        <w:t xml:space="preserve">1.</w:t>
-      </w:r>
-      <w:r>
-        <w:t xml:space="preserve"> </w:t>
-      </w:r>
+    </w:p>
+    <w:p>
+      <w:pPr>
+        <w:pStyle w:val="Compact"/>
+        <w:numPr>
+          <w:ilvl w:val="0"/>
+          <w:numId w:val="1005"/>
+        </w:numPr>
+      </w:pPr>
       <w:r>
         <w:rPr>
           <w:b/>
@@ -2082,15 +2129,15 @@
       <w:r>
         <w:t xml:space="preserve">: Audio is captured on-device.</w:t>
       </w:r>
-      <w:r>
-        <w:t xml:space="preserve"> </w:t>
-      </w:r>
-      <w:r>
-        <w:t xml:space="preserve">2.</w:t>
-      </w:r>
-      <w:r>
-        <w:t xml:space="preserve"> </w:t>
-      </w:r>
+    </w:p>
+    <w:p>
+      <w:pPr>
+        <w:pStyle w:val="Compact"/>
+        <w:numPr>
+          <w:ilvl w:val="0"/>
+          <w:numId w:val="1005"/>
+        </w:numPr>
+      </w:pPr>
       <w:r>
         <w:rPr>
           <w:b/>
@@ -2113,15 +2160,15 @@
       <w:r>
         <w:t xml:space="preserve">) converts audio to text without sending data to the cloud.</w:t>
       </w:r>
-      <w:r>
-        <w:t xml:space="preserve"> </w:t>
-      </w:r>
-      <w:r>
-        <w:t xml:space="preserve">3.</w:t>
-      </w:r>
-      <w:r>
-        <w:t xml:space="preserve"> </w:t>
-      </w:r>
+    </w:p>
+    <w:p>
+      <w:pPr>
+        <w:pStyle w:val="Compact"/>
+        <w:numPr>
+          <w:ilvl w:val="0"/>
+          <w:numId w:val="1005"/>
+        </w:numPr>
+      </w:pPr>
       <w:r>
         <w:rPr>
           <w:b/>
@@ -2174,15 +2221,15 @@
       <w:r>
         <w:t xml:space="preserve">) extracts the VAC parameters.</w:t>
       </w:r>
-      <w:r>
-        <w:t xml:space="preserve"> </w:t>
-      </w:r>
-      <w:r>
-        <w:t xml:space="preserve">4.</w:t>
-      </w:r>
-      <w:r>
-        <w:t xml:space="preserve"> </w:t>
-      </w:r>
+    </w:p>
+    <w:p>
+      <w:pPr>
+        <w:pStyle w:val="Compact"/>
+        <w:numPr>
+          <w:ilvl w:val="0"/>
+          <w:numId w:val="1005"/>
+        </w:numPr>
+      </w:pPr>
       <w:r>
         <w:rPr>
           <w:b/>
@@ -2194,29 +2241,152 @@
         <w:t xml:space="preserve">: A Named Entity Recognition (NER) system identifies and scrubs Person Identifiable Information (PII) before any data is passed to the persistence layer (Observer).</w:t>
       </w:r>
     </w:p>
-    <w:p>
-      <w:r>
-        <w:pict>
-          <v:rect style="width:0;height:1.5pt" o:hralign="center" o:hrstd="t" o:hr="t"/>
-        </w:pict>
-      </w:r>
-    </w:p>
-    <w:bookmarkEnd w:id="35"/>
-    <w:bookmarkEnd w:id="36"/>
-    <w:bookmarkStart w:id="37" w:name="claims"/>
-    <w:p>
-      <w:pPr>
-        <w:pStyle w:val="Heading2"/>
-      </w:pPr>
-      <w:r>
-        <w:t xml:space="preserve">CLAIMS</w:t>
-      </w:r>
-    </w:p>
-    <w:p>
-      <w:pPr>
+    <w:bookmarkEnd w:id="38"/>
+    <w:bookmarkStart w:id="39" w:name="X8f64a9318c3f6febd71bd902d64d25ef0ad2061"/>
+    <w:p>
+      <w:pPr>
+        <w:pStyle w:val="Heading3"/>
+      </w:pPr>
+      <w:r>
+        <w:t xml:space="preserve">6. Industrial Applicability and Potential Embodiments</w:t>
+      </w:r>
+    </w:p>
+    <w:p>
+      <w:pPr>
+        <w:pStyle w:val="FirstParagraph"/>
+      </w:pPr>
+      <w:r>
+        <w:t xml:space="preserve">While the preferred embodiment describes a personal emotional intelligence tool, the invention’s geometric framework has broad industrial applicability across multiple domains:</w:t>
+      </w:r>
+    </w:p>
+    <w:p>
+      <w:pPr>
+        <w:pStyle w:val="Compact"/>
         <w:numPr>
           <w:ilvl w:val="0"/>
-          <w:numId w:val="1005"/>
+          <w:numId w:val="1006"/>
+        </w:numPr>
+      </w:pPr>
+      <w:r>
+        <w:rPr>
+          <w:b/>
+          <w:bCs/>
+        </w:rPr>
+        <w:t xml:space="preserve">Clinical &amp; Mental Health:</w:t>
+      </w:r>
+      <w:r>
+        <w:t xml:space="preserve"> </w:t>
+      </w:r>
+      <w:r>
+        <w:t xml:space="preserve">Monitoring patient stability in real-time, detecting</w:t>
+      </w:r>
+      <w:r>
+        <w:t xml:space="preserve"> </w:t>
+      </w:r>
+      <w:r>
+        <w:t xml:space="preserve">“flooding”</w:t>
+      </w:r>
+      <w:r>
+        <w:t xml:space="preserve"> </w:t>
+      </w:r>
+      <w:r>
+        <w:t xml:space="preserve">events in trauma therapy, or tracking longitudinal emotional trajectories for diagnosis.</w:t>
+      </w:r>
+    </w:p>
+    <w:p>
+      <w:pPr>
+        <w:pStyle w:val="Compact"/>
+        <w:numPr>
+          <w:ilvl w:val="0"/>
+          <w:numId w:val="1006"/>
+        </w:numPr>
+      </w:pPr>
+      <w:r>
+        <w:rPr>
+          <w:b/>
+          <w:bCs/>
+        </w:rPr>
+        <w:t xml:space="preserve">Artificial Intelligence &amp; Robotics:</w:t>
+      </w:r>
+      <w:r>
+        <w:t xml:space="preserve"> </w:t>
+      </w:r>
+      <w:r>
+        <w:t xml:space="preserve">Providing autonomous agents or Non-Player Characters (NPCs) with continuous, non-binary emotional states, allowing for smoother behavioral transitions than finite-state machines.</w:t>
+      </w:r>
+    </w:p>
+    <w:p>
+      <w:pPr>
+        <w:pStyle w:val="Compact"/>
+        <w:numPr>
+          <w:ilvl w:val="0"/>
+          <w:numId w:val="1006"/>
+        </w:numPr>
+      </w:pPr>
+      <w:r>
+        <w:rPr>
+          <w:b/>
+          <w:bCs/>
+        </w:rPr>
+        <w:t xml:space="preserve">Human-Computer Interaction (HCI):</w:t>
+      </w:r>
+      <w:r>
+        <w:t xml:space="preserve"> </w:t>
+      </w:r>
+      <w:r>
+        <w:t xml:space="preserve">Enhancing sentiment analysis in customer service bots to detect</w:t>
+      </w:r>
+      <w:r>
+        <w:t xml:space="preserve"> </w:t>
+      </w:r>
+      <w:r>
+        <w:t xml:space="preserve">“connection”</w:t>
+      </w:r>
+      <w:r>
+        <w:t xml:space="preserve"> </w:t>
+      </w:r>
+      <w:r>
+        <w:t xml:space="preserve">(empathy/pity) nuances that standard sentiment models miss.</w:t>
+      </w:r>
+    </w:p>
+    <w:p>
+      <w:pPr>
+        <w:pStyle w:val="Compact"/>
+        <w:numPr>
+          <w:ilvl w:val="0"/>
+          <w:numId w:val="1006"/>
+        </w:numPr>
+      </w:pPr>
+      <w:r>
+        <w:rPr>
+          <w:b/>
+          <w:bCs/>
+        </w:rPr>
+        <w:t xml:space="preserve">Bio-Feedback Training:</w:t>
+      </w:r>
+      <w:r>
+        <w:t xml:space="preserve"> </w:t>
+      </w:r>
+      <w:r>
+        <w:t xml:space="preserve">Powering wearable devices that provide haptic or visual feedback based on the angular velocity of emotional change to train emotional regulation.</w:t>
+      </w:r>
+    </w:p>
+    <w:bookmarkEnd w:id="39"/>
+    <w:bookmarkEnd w:id="40"/>
+    <w:bookmarkStart w:id="41" w:name="claims"/>
+    <w:p>
+      <w:pPr>
+        <w:pStyle w:val="Heading2"/>
+      </w:pPr>
+      <w:r>
+        <w:t xml:space="preserve">CLAIMS</w:t>
+      </w:r>
+    </w:p>
+    <w:p>
+      <w:pPr>
+        <w:numPr>
+          <w:ilvl w:val="0"/>
+          <w:numId w:val="1007"/>
         </w:numPr>
       </w:pPr>
       <w:r>
@@ -2228,7 +2398,7 @@
         <w:pStyle w:val="Compact"/>
         <w:numPr>
           <w:ilvl w:val="1"/>
-          <w:numId w:val="1006"/>
+          <w:numId w:val="1008"/>
         </w:numPr>
       </w:pPr>
       <w:r>
@@ -2240,7 +2410,7 @@
         <w:pStyle w:val="Compact"/>
         <w:numPr>
           <w:ilvl w:val="1"/>
-          <w:numId w:val="1006"/>
+          <w:numId w:val="1008"/>
         </w:numPr>
       </w:pPr>
       <w:r>
@@ -2252,7 +2422,7 @@
         <w:pStyle w:val="Compact"/>
         <w:numPr>
           <w:ilvl w:val="1"/>
-          <w:numId w:val="1006"/>
+          <w:numId w:val="1008"/>
         </w:numPr>
       </w:pPr>
       <w:r>
@@ -2263,7 +2433,7 @@
       <w:pPr>
         <w:numPr>
           <w:ilvl w:val="0"/>
-          <w:numId w:val="1005"/>
+          <w:numId w:val="1007"/>
         </w:numPr>
       </w:pPr>
       <w:r>
@@ -2286,7 +2456,7 @@
       <w:pPr>
         <w:numPr>
           <w:ilvl w:val="0"/>
-          <w:numId w:val="1005"/>
+          <w:numId w:val="1007"/>
         </w:numPr>
       </w:pPr>
       <w:r>
@@ -2297,7 +2467,7 @@
       <w:pPr>
         <w:numPr>
           <w:ilvl w:val="0"/>
-          <w:numId w:val="1005"/>
+          <w:numId w:val="1007"/>
         </w:numPr>
       </w:pPr>
       <w:r>
@@ -2309,7 +2479,7 @@
         <w:pStyle w:val="Compact"/>
         <w:numPr>
           <w:ilvl w:val="1"/>
-          <w:numId w:val="1007"/>
+          <w:numId w:val="1009"/>
         </w:numPr>
       </w:pPr>
       <w:r>
@@ -2321,7 +2491,7 @@
         <w:pStyle w:val="Compact"/>
         <w:numPr>
           <w:ilvl w:val="1"/>
-          <w:numId w:val="1007"/>
+          <w:numId w:val="1009"/>
         </w:numPr>
       </w:pPr>
       <w:r>
@@ -2333,7 +2503,7 @@
         <w:pStyle w:val="Compact"/>
         <w:numPr>
           <w:ilvl w:val="1"/>
-          <w:numId w:val="1007"/>
+          <w:numId w:val="1009"/>
         </w:numPr>
       </w:pPr>
       <w:r>
@@ -2345,21 +2515,21 @@
         <w:pStyle w:val="Compact"/>
         <w:numPr>
           <w:ilvl w:val="1"/>
+          <w:numId w:val="1009"/>
+        </w:numPr>
+      </w:pPr>
+      <w:r>
+        <w:t xml:space="preserve">rendering a three-dimensional object whose orientation corresponds to the interpolated path.</w:t>
+      </w:r>
+    </w:p>
+    <w:p>
+      <w:pPr>
+        <w:numPr>
+          <w:ilvl w:val="0"/>
           <w:numId w:val="1007"/>
         </w:numPr>
       </w:pPr>
       <w:r>
-        <w:t xml:space="preserve">rendering a three-dimensional object whose orientation corresponds to the interpolated path.</w:t>
-      </w:r>
-    </w:p>
-    <w:p>
-      <w:pPr>
-        <w:numPr>
-          <w:ilvl w:val="0"/>
-          <w:numId w:val="1005"/>
-        </w:numPr>
-      </w:pPr>
-      <w:r>
         <w:t xml:space="preserve">The method of Claim 4, further comprising calculating an angular velocity of the transition and triggering a user alert if said velocity exceeds a predetermined</w:t>
       </w:r>
       <w:r>
@@ -2375,8 +2545,8 @@
         <w:t xml:space="preserve">threshold.</w:t>
       </w:r>
     </w:p>
-    <w:bookmarkEnd w:id="37"/>
-    <w:bookmarkEnd w:id="38"/>
+    <w:bookmarkEnd w:id="41"/>
+    <w:bookmarkEnd w:id="42"/>
     <w:sectPr>
       <w:footnotePr>
         <w:numRestart w:val="eachSect"/>
@@ -2778,6 +2948,39 @@
     <w:abstractNumId w:val="991"/>
   </w:num>
   <w:num w:numId="1007">
+    <w:abstractNumId w:val="99411"/>
+    <w:lvlOverride w:ilvl="0">
+      <w:startOverride w:val="1"/>
+    </w:lvlOverride>
+    <w:lvlOverride w:ilvl="1">
+      <w:startOverride w:val="1"/>
+    </w:lvlOverride>
+    <w:lvlOverride w:ilvl="2">
+      <w:startOverride w:val="1"/>
+    </w:lvlOverride>
+    <w:lvlOverride w:ilvl="3">
+      <w:startOverride w:val="1"/>
+    </w:lvlOverride>
+    <w:lvlOverride w:ilvl="4">
+      <w:startOverride w:val="1"/>
+    </w:lvlOverride>
+    <w:lvlOverride w:ilvl="5">
+      <w:startOverride w:val="1"/>
+    </w:lvlOverride>
+    <w:lvlOverride w:ilvl="6">
+      <w:startOverride w:val="1"/>
+    </w:lvlOverride>
+    <w:lvlOverride w:ilvl="7">
+      <w:startOverride w:val="1"/>
+    </w:lvlOverride>
+    <w:lvlOverride w:ilvl="8">
+      <w:startOverride w:val="1"/>
+    </w:lvlOverride>
+  </w:num>
+  <w:num w:numId="1008">
+    <w:abstractNumId w:val="991"/>
+  </w:num>
+  <w:num w:numId="1009">
     <w:abstractNumId w:val="991"/>
   </w:num>
 </w:numbering>

</xml_diff>